<commit_message>
release: synchronize DSTS 1.1.0 source and staging manifests
</commit_message>
<xml_diff>
--- a/backend/apps/appeal-certificate-service/assets/DSTS_Certificate_Template.docx
+++ b/backend/apps/appeal-certificate-service/assets/DSTS_Certificate_Template.docx
@@ -1,6 +1,968 @@
 
-<file path=word/document.xml><?xml version="1.0" encoding="UTF-8" standalone="yes"?>
-<w:document xmlns:wpc="http://schemas.microsoft.com/office/word/2010/wordprocessingCanvas" xmlns:cx="http://schemas.microsoft.com/office/drawing/2014/chartex" xmlns:cx1="http://schemas.microsoft.com/office/drawing/2015/9/8/chartex" xmlns:cx2="http://schemas.microsoft.com/office/drawing/2015/10/21/chartex" xmlns:cx3="http://schemas.microsoft.com/office/drawing/2016/5/9/chartex" xmlns:cx4="http://schemas.microsoft.com/office/drawing/2016/5/10/chartex" xmlns:cx5="http://schemas.microsoft.com/office/drawing/2016/5/11/chartex" xmlns:cx6="http://schemas.microsoft.com/office/drawing/2016/5/12/chartex" xmlns:cx7="http://schemas.microsoft.com/office/drawing/2016/5/13/chartex" xmlns:cx8="http://schemas.microsoft.com/office/drawing/2016/5/14/chartex" xmlns:mc="http://schemas.openxmlformats.org/markup-compatibility/2006" xmlns:aink="http://schemas.microsoft.com/office/drawing/2016/ink" xmlns:am3d="http://schemas.microsoft.com/office/drawing/2017/model3d" xmlns:o="urn:schemas-microsoft-com:office:office" xmlns:r="http://schemas.openxmlformats.org/officeDocument/2006/relationships" xmlns:m="http://schemas.openxmlformats.org/officeDocument/2006/math" xmlns:v="urn:schemas-microsoft-com:vml" xmlns:wp14="http://schemas.microsoft.com/office/word/2010/wordprocessingDrawing" xmlns:wp="http://schemas.openxmlformats.org/drawingml/2006/wordprocessingDrawing" xmlns:w10="urn:schemas-microsoft-com:office:word" xmlns:w="http://schemas.openxmlformats.org/wordprocessingml/2006/main" xmlns:w14="http://schemas.microsoft.com/office/word/2010/wordml" xmlns:w15="http://schemas.microsoft.com/office/word/2012/wordml" xmlns:w16cex="http://schemas.microsoft.com/office/word/2018/wordml/cex" xmlns:w16cid="http://schemas.microsoft.com/office/word/2016/wordml/cid" xmlns:w16="http://schemas.microsoft.com/office/word/2018/wordml" xmlns:w16sdtdh="http://schemas.microsoft.com/office/word/2020/wordml/sdtdatahash" xmlns:w16se="http://schemas.microsoft.com/office/word/2015/wordml/symex" xmlns:wpg="http://schemas.microsoft.com/office/word/2010/wordprocessingGroup" xmlns:wpi="http://schemas.microsoft.com/office/word/2010/wordprocessingInk" xmlns:wne="http://schemas.microsoft.com/office/word/2006/wordml" xmlns:wps="http://schemas.microsoft.com/office/word/2010/wordprocessingShape" mc:Ignorable="w14 w15 w16se w16cid w16 w16cex w16sdtdh wp14"><w:body><w:p><w:pPr><w:spacing w:line="20" w:lineRule="exact"/></w:pPr><w:r><w:rPr><w:noProof/></w:rPr><w:drawing><wp:anchor distT="0" distB="0" distL="0" distR="0" simplePos="0" relativeHeight="9902952" behindDoc="1" locked="0" layoutInCell="1" allowOverlap="1" wp14:anchorId="26443A98" wp14:editId="22889397"><wp:simplePos x="0" y="0"/><wp:positionH relativeFrom="page"><wp:posOffset>0</wp:posOffset></wp:positionH><wp:positionV relativeFrom="page"><wp:posOffset>0</wp:posOffset></wp:positionV><wp:extent cx="6858000" cy="9902952"/><wp:effectExtent l="0" t="0" r="0" b="0"/><wp:wrapNone/><wp:docPr id="1" name="bg" descr="Certificate design (border, logos, clouds, boxes, fixed Dzongkha labels)" title="Certificate background"/><wp:cNvGraphicFramePr><a:graphicFrameLocks xmlns:a="http://schemas.openxmlformats.org/drawingml/2006/main" noChangeAspect="1"/></wp:cNvGraphicFramePr><a:graphic xmlns:a="http://schemas.openxmlformats.org/drawingml/2006/main"><a:graphicData uri="http://schemas.openxmlformats.org/drawingml/2006/picture"><pic:pic xmlns:pic="http://schemas.openxmlformats.org/drawingml/2006/picture"><pic:nvPicPr><pic:cNvPr id="0" name=""/><pic:cNvPicPr><a:picLocks noChangeAspect="1" noChangeArrowheads="1"/></pic:cNvPicPr></pic:nvPicPr><pic:blipFill><a:blip r:embed="rId5"/><a:srcRect/><a:stretch><a:fillRect/></a:stretch></pic:blipFill><pic:spPr bwMode="auto"><a:xfrm><a:off x="0" y="0"/><a:ext cx="6858000" cy="9902952"/></a:xfrm><a:prstGeom prst="rect"><a:avLst/></a:prstGeom></pic:spPr></pic:pic></a:graphicData></a:graphic></wp:anchor></w:drawing></w:r></w:p><w:p><w:pPr><w:framePr w:w="2640" w:h="340" w:hRule="exact" w:wrap="none" w:vAnchor="page" w:hAnchor="page" w:x="4080" w:y="2754"/><w:spacing w:line="340" w:lineRule="exact"/><w:jc w:val="center"/></w:pPr><w:r><w:rPr><w:rFonts w:ascii="Times New Roman" w:eastAsia="Times New Roman" w:hAnsi="Times New Roman" w:cs="Times New Roman"/><w:sz w:val="28"/><w:szCs w:val="28"/></w:rPr><w:t>DSTS CERTIFICATE</w:t></w:r></w:p><w:p><w:pPr><w:framePr w:w="2000" w:h="304" w:hRule="exact" w:wrap="none" w:vAnchor="page" w:hAnchor="page" w:x="554" w:y="4550"/><w:spacing w:line="304" w:lineRule="exact"/></w:pPr><w:r><w:rPr><w:rFonts w:ascii="Book Antiqua" w:eastAsia="Book Antiqua" w:hAnsi="Book Antiqua" w:cs="Book Antiqua"/></w:rPr><w:t>Name</w:t></w:r></w:p><w:p><w:pPr><w:framePr w:w="2000" w:h="304" w:hRule="exact" w:wrap="none" w:vAnchor="page" w:hAnchor="page" w:x="628" w:y="5480"/><w:spacing w:line="304" w:lineRule="exact"/></w:pPr><w:r><w:rPr><w:rFonts w:ascii="Book Antiqua" w:eastAsia="Book Antiqua" w:hAnsi="Book Antiqua" w:cs="Book Antiqua"/></w:rPr><w:t>ID No.</w:t></w:r></w:p><w:p><w:pPr><w:framePr w:w="2800" w:h="304" w:hRule="exact" w:wrap="none" w:vAnchor="page" w:hAnchor="page" w:x="554" w:y="6500"/><w:spacing w:line="304" w:lineRule="exact"/></w:pPr><w:r><w:rPr><w:rFonts w:ascii="Book Antiqua" w:eastAsia="Book Antiqua" w:hAnsi="Book Antiqua" w:cs="Book Antiqua"/></w:rPr><w:t>Date of Birth</w:t></w:r></w:p><w:p><w:pPr><w:framePr w:w="2400" w:h="304" w:hRule="exact" w:wrap="none" w:vAnchor="page" w:hAnchor="page" w:x="540" w:y="7296"/><w:spacing w:line="304" w:lineRule="exact"/></w:pPr><w:r><w:rPr><w:rFonts w:ascii="Book Antiqua" w:eastAsia="Book Antiqua" w:hAnsi="Book Antiqua" w:cs="Book Antiqua"/></w:rPr><w:t>DSTS No.</w:t></w:r></w:p><w:p><w:pPr><w:framePr w:w="3800" w:h="304" w:hRule="exact" w:wrap="none" w:vAnchor="page" w:hAnchor="page" w:x="512" w:y="8158"/><w:spacing w:line="304" w:lineRule="exact"/></w:pPr><w:r><w:rPr><w:rFonts w:ascii="Book Antiqua" w:eastAsia="Book Antiqua" w:hAnsi="Book Antiqua" w:cs="Book Antiqua"/></w:rPr><w:t>Date of Examination</w:t></w:r></w:p><w:p><w:pPr><w:framePr w:w="2500" w:h="304" w:hRule="exact" w:wrap="none" w:vAnchor="page" w:hAnchor="page" w:x="1008" w:y="9674"/><w:spacing w:line="304" w:lineRule="exact"/></w:pPr><w:r><w:rPr><w:rFonts w:ascii="Book Antiqua" w:eastAsia="Book Antiqua" w:hAnsi="Book Antiqua" w:cs="Book Antiqua"/></w:rPr><w:t>LISTENING</w:t></w:r></w:p><w:p><w:pPr><w:framePr w:w="2000" w:h="304" w:hRule="exact" w:wrap="none" w:vAnchor="page" w:hAnchor="page" w:x="1034" w:y="10498"/><w:spacing w:line="304" w:lineRule="exact"/></w:pPr><w:r><w:rPr><w:rFonts w:ascii="Book Antiqua" w:eastAsia="Book Antiqua" w:hAnsi="Book Antiqua" w:cs="Book Antiqua"/></w:rPr><w:t>READING</w:t></w:r></w:p><w:p><w:pPr><w:framePr w:w="2000" w:h="304" w:hRule="exact" w:wrap="none" w:vAnchor="page" w:hAnchor="page" w:x="1008" w:y="11360"/><w:spacing w:line="304" w:lineRule="exact"/></w:pPr><w:r><w:rPr><w:rFonts w:ascii="Book Antiqua" w:eastAsia="Book Antiqua" w:hAnsi="Book Antiqua" w:cs="Book Antiqua"/></w:rPr><w:t>WRITING</w:t></w:r></w:p><w:p><w:pPr><w:framePr w:w="2500" w:h="304" w:hRule="exact" w:wrap="none" w:vAnchor="page" w:hAnchor="page" w:x="1034" w:y="12138"/><w:spacing w:line="304" w:lineRule="exact"/></w:pPr><w:r><w:rPr><w:rFonts w:ascii="Book Antiqua" w:eastAsia="Book Antiqua" w:hAnsi="Book Antiqua" w:cs="Book Antiqua"/></w:rPr><w:t>SPEAKING</w:t></w:r></w:p><w:p><w:pPr><w:framePr w:w="2700" w:h="326" w:hRule="exact" w:wrap="none" w:vAnchor="page" w:hAnchor="page" w:x="5762" w:y="10124"/><w:spacing w:line="326" w:lineRule="exact"/></w:pPr><w:r><w:rPr><w:rFonts w:ascii="Book Antiqua" w:eastAsia="Book Antiqua" w:hAnsi="Book Antiqua" w:cs="Book Antiqua"/><w:b/><w:bCs/><w:color w:val="00B050"/><w:sz w:val="28"/><w:szCs w:val="28"/></w:rPr><w:t>OVERALL LEVEL</w:t></w:r></w:p><w:p><w:pPr><w:framePr w:w="3500" w:h="270" w:hRule="exact" w:wrap="none" w:vAnchor="page" w:hAnchor="page" w:x="6836" w:y="11508"/><w:spacing w:line="270" w:lineRule="exact"/></w:pPr><w:r><w:rPr><w:rFonts w:ascii="Book Antiqua" w:eastAsia="Book Antiqua" w:hAnsi="Book Antiqua" w:cs="Book Antiqua"/><w:sz w:val="20"/><w:szCs w:val="20"/></w:rPr><w:t xml:space="preserve">This certificate is valid </w:t></w:r><w:proofErr w:type="spellStart"/><w:r><w:rPr><w:rFonts w:ascii="Book Antiqua" w:eastAsia="Book Antiqua" w:hAnsi="Book Antiqua" w:cs="Book Antiqua"/><w:sz w:val="20"/><w:szCs w:val="20"/></w:rPr><w:t>tilL</w:t></w:r><w:proofErr w:type="spellEnd"/></w:p><w:p><w:pPr><w:framePr w:w="3000" w:h="304" w:hRule="exact" w:wrap="none" w:vAnchor="page" w:hAnchor="page" w:x="1324" w:y="14556"/><w:spacing w:line="304" w:lineRule="exact"/></w:pPr><w:r><w:rPr><w:rFonts w:ascii="Times New Roman" w:eastAsia="Times New Roman" w:hAnsi="Times New Roman" w:cs="Times New Roman"/><w:sz w:val="26"/><w:szCs w:val="26"/></w:rPr><w:t>Chief of Examination</w:t></w:r></w:p><w:p><w:pPr><w:framePr w:w="3300" w:h="304" w:hRule="exact" w:wrap="none" w:vAnchor="page" w:hAnchor="page" w:x="6922" w:y="14556"/><w:spacing w:line="304" w:lineRule="exact"/></w:pPr><w:r><w:rPr><w:rFonts w:ascii="Times New Roman" w:eastAsia="Times New Roman" w:hAnsi="Times New Roman" w:cs="Times New Roman"/><w:sz w:val="26"/><w:szCs w:val="26"/></w:rPr><w:t>Chief Executive, DSTS</w:t></w:r></w:p><w:p><w:pPr><w:framePr w:w="1600" w:h="360" w:hRule="exact" w:wrap="none" w:vAnchor="page" w:hAnchor="page" w:x="8000" w:y="4068"/><w:spacing w:line="360" w:lineRule="exact"/><w:jc w:val="center"/></w:pPr><w:r><w:rPr><w:sz w:val="36"/><w:szCs w:val="36"/></w:rPr><w:t>PHOTO</w:t></w:r></w:p><w:p><w:pPr><w:framePr w:w="6000" w:h="274" w:hRule="exact" w:wrap="none" w:vAnchor="page" w:hAnchor="page" w:x="2144" w:y="3994"/><w:spacing w:line="274" w:lineRule="exact"/></w:pPr><w:proofErr w:type="spellStart"/><w:r><w:rPr><w:rFonts w:ascii="Microsoft Himalaya" w:eastAsia="Microsoft Himalaya" w:hAnsi="Microsoft Himalaya" w:cs="Microsoft Himalaya"/></w:rPr><w:t>{holderNameDz}</w:t></w:r><w:r><w:rPr><w:rFonts w:ascii="Microsoft Himalaya" w:eastAsia="Microsoft Himalaya" w:hAnsi="Microsoft Himalaya" w:cs="Microsoft Himalaya"/></w:rPr><w:t> </w:t></w:r></w:p><w:p><w:pPr><w:framePr w:w="6000" w:h="304" w:hRule="exact" w:wrap="none" w:vAnchor="page" w:hAnchor="page" w:x="2144" w:y="4614"/><w:spacing w:line="304" w:lineRule="exact"/></w:pPr><w:r><w:rPr><w:sz w:val="28"/><w:szCs w:val="28"/></w:rPr><w:t>{holderName}</w:t></w:p><w:p><w:pPr><w:framePr w:w="6000" w:h="318" w:hRule="exact" w:wrap="none" w:vAnchor="page" w:hAnchor="page" w:x="2138" w:y="5328"/><w:spacing w:line="318" w:lineRule="exact"/></w:pPr><w:r><w:rPr><w:rFonts w:ascii="Microsoft Himalaya" w:eastAsia="Microsoft Himalaya" w:hAnsi="Microsoft Himalaya" w:cs="Microsoft Himalaya"/><w:sz w:val="28"/><w:szCs w:val="28"/></w:rPr><w:t>{cidDz}</w:t></w:r></w:p><w:p><w:pPr><w:framePr w:w="6000" w:h="318" w:hRule="exact" w:wrap="none" w:vAnchor="page" w:hAnchor="page" w:x="2138" w:y="5694"/><w:spacing w:line="318" w:lineRule="exact"/></w:pPr><w:r><w:rPr><w:sz w:val="32"/><w:szCs w:val="32"/></w:rPr><w:t>{cid}</w:t></w:r></w:p><w:p><w:pPr><w:framePr w:w="5206" w:h="360" w:hRule="exact" w:wrap="none" w:vAnchor="page" w:hAnchor="page" w:x="1992" w:y="6352"/><w:tabs><w:tab w:val="center" w:pos="400"/><w:tab w:val="center" w:pos="1010"/><w:tab w:val="center" w:pos="1676"/><w:tab w:val="center" w:pos="2304"/><w:tab w:val="center" w:pos="2910"/><w:tab w:val="center" w:pos="3556"/><w:tab w:val="center" w:pos="4182"/><w:tab w:val="center" w:pos="4806"/></w:tabs><w:spacing w:line="360" w:lineRule="exact"/></w:pPr><w:r><w:rPr><w:rFonts w:ascii="Microsoft Himalaya" w:eastAsia="Microsoft Himalaya" w:hAnsi="Microsoft Himalaya" w:cs="Microsoft Himalaya"/><w:sz w:val="32"/><w:szCs w:val="32"/></w:rPr><w:tab/></w:r><w:r><w:rPr><w:rFonts w:ascii="Microsoft Himalaya" w:eastAsia="Microsoft Himalaya" w:hAnsi="Microsoft Himalaya" w:cs="Microsoft Himalaya"/><w:color w:val="3F78B5"/><w:sz w:val="32"/><w:szCs w:val="32"/></w:rPr><w:t>{dob1}</w:t></w:r><w:r><w:rPr><w:rFonts w:ascii="Microsoft Himalaya" w:eastAsia="Microsoft Himalaya" w:hAnsi="Microsoft Himalaya" w:cs="Microsoft Himalaya"/><w:sz w:val="32"/><w:szCs w:val="32"/></w:rPr><w:tab/></w:r><w:r><w:rPr><w:rFonts w:ascii="Microsoft Himalaya" w:eastAsia="Microsoft Himalaya" w:hAnsi="Microsoft Himalaya" w:cs="Microsoft Himalaya"/><w:color w:val="3F78B5"/><w:sz w:val="32"/><w:szCs w:val="32"/></w:rPr><w:t>{dob2}</w:t></w:r><w:r><w:rPr><w:rFonts w:ascii="Microsoft Himalaya" w:eastAsia="Microsoft Himalaya" w:hAnsi="Microsoft Himalaya" w:cs="Microsoft Himalaya"/><w:sz w:val="32"/><w:szCs w:val="32"/></w:rPr><w:tab/></w:r><w:r><w:rPr><w:rFonts w:ascii="Microsoft Himalaya" w:eastAsia="Microsoft Himalaya" w:hAnsi="Microsoft Himalaya" w:cs="Microsoft Himalaya"/><w:color w:val="3F78B5"/><w:sz w:val="32"/><w:szCs w:val="32"/></w:rPr><w:t>{dob3}</w:t></w:r><w:r><w:rPr><w:rFonts w:ascii="Microsoft Himalaya" w:eastAsia="Microsoft Himalaya" w:hAnsi="Microsoft Himalaya" w:cs="Microsoft Himalaya"/><w:sz w:val="32"/><w:szCs w:val="32"/></w:rPr><w:tab/></w:r><w:r><w:rPr><w:rFonts w:ascii="Microsoft Himalaya" w:eastAsia="Microsoft Himalaya" w:hAnsi="Microsoft Himalaya" w:cs="Microsoft Himalaya"/><w:color w:val="3F78B5"/><w:sz w:val="32"/><w:szCs w:val="32"/></w:rPr><w:t>{dob4}</w:t></w:r><w:r><w:rPr><w:rFonts w:ascii="Microsoft Himalaya" w:eastAsia="Microsoft Himalaya" w:hAnsi="Microsoft Himalaya" w:cs="Microsoft Himalaya"/><w:sz w:val="32"/><w:szCs w:val="32"/></w:rPr><w:tab/></w:r><w:r><w:rPr><w:rFonts w:ascii="Microsoft Himalaya" w:eastAsia="Microsoft Himalaya" w:hAnsi="Microsoft Himalaya" w:cs="Microsoft Himalaya"/><w:color w:val="3F78B5"/><w:sz w:val="32"/><w:szCs w:val="32"/></w:rPr><w:t>{dob5}</w:t></w:r><w:r><w:rPr><w:rFonts w:ascii="Microsoft Himalaya" w:eastAsia="Microsoft Himalaya" w:hAnsi="Microsoft Himalaya" w:cs="Microsoft Himalaya"/><w:sz w:val="32"/><w:szCs w:val="32"/></w:rPr><w:tab/></w:r><w:r><w:rPr><w:rFonts w:ascii="Microsoft Himalaya" w:eastAsia="Microsoft Himalaya" w:hAnsi="Microsoft Himalaya" w:cs="Microsoft Himalaya"/><w:color w:val="3F78B5"/><w:sz w:val="32"/><w:szCs w:val="32"/></w:rPr><w:t>{dob6}</w:t></w:r><w:r><w:rPr><w:rFonts w:ascii="Microsoft Himalaya" w:eastAsia="Microsoft Himalaya" w:hAnsi="Microsoft Himalaya" w:cs="Microsoft Himalaya"/><w:sz w:val="32"/><w:szCs w:val="32"/></w:rPr><w:tab/></w:r><w:r><w:rPr><w:rFonts w:ascii="Microsoft Himalaya" w:eastAsia="Microsoft Himalaya" w:hAnsi="Microsoft Himalaya" w:cs="Microsoft Himalaya"/><w:color w:val="3F78B5"/><w:sz w:val="32"/><w:szCs w:val="32"/></w:rPr><w:t>{dob7}</w:t></w:r><w:r><w:rPr><w:rFonts w:ascii="Microsoft Himalaya" w:eastAsia="Microsoft Himalaya" w:hAnsi="Microsoft Himalaya" w:cs="Microsoft Himalaya"/><w:sz w:val="32"/><w:szCs w:val="32"/></w:rPr><w:tab/></w:r><w:r><w:rPr><w:rFonts w:ascii="Microsoft Himalaya" w:eastAsia="Microsoft Himalaya" w:hAnsi="Microsoft Himalaya" w:cs="Microsoft Himalaya"/><w:color w:val="3F78B5"/><w:sz w:val="32"/><w:szCs w:val="32"/></w:rPr><w:t>{dob8}</w:t></w:r></w:p><w:p><w:pPr><w:framePr w:w="5206" w:h="360" w:hRule="exact" w:wrap="none" w:vAnchor="page" w:hAnchor="page" w:x="1992" w:y="7154"/><w:tabs><w:tab w:val="center" w:pos="400"/><w:tab w:val="center" w:pos="1010"/><w:tab w:val="center" w:pos="1676"/><w:tab w:val="center" w:pos="2304"/><w:tab w:val="center" w:pos="2910"/><w:tab w:val="center" w:pos="3556"/><w:tab w:val="center" w:pos="4182"/><w:tab w:val="center" w:pos="4806"/></w:tabs><w:spacing w:line="360" w:lineRule="exact"/></w:pPr><w:r><w:rPr><w:rFonts w:ascii="Microsoft Himalaya" w:eastAsia="Microsoft Himalaya" w:hAnsi="Microsoft Himalaya" w:cs="Microsoft Himalaya"/><w:sz w:val="32"/><w:szCs w:val="32"/></w:rPr><w:tab/></w:r><w:r><w:rPr><w:rFonts w:ascii="Microsoft Himalaya" w:eastAsia="Microsoft Himalaya" w:hAnsi="Microsoft Himalaya" w:cs="Microsoft Himalaya"/><w:color w:val="3F78B5"/><w:sz w:val="32"/><w:szCs w:val="32"/></w:rPr><w:t>{dstsNo1}</w:t></w:r><w:r><w:rPr><w:rFonts w:ascii="Microsoft Himalaya" w:eastAsia="Microsoft Himalaya" w:hAnsi="Microsoft Himalaya" w:cs="Microsoft Himalaya"/><w:sz w:val="32"/><w:szCs w:val="32"/></w:rPr><w:tab/></w:r><w:r><w:rPr><w:rFonts w:ascii="Microsoft Himalaya" w:eastAsia="Microsoft Himalaya" w:hAnsi="Microsoft Himalaya" w:cs="Microsoft Himalaya"/><w:color w:val="3F78B5"/><w:sz w:val="32"/><w:szCs w:val="32"/></w:rPr><w:t>{dstsNo2}</w:t></w:r><w:r><w:rPr><w:rFonts w:ascii="Microsoft Himalaya" w:eastAsia="Microsoft Himalaya" w:hAnsi="Microsoft Himalaya" w:cs="Microsoft Himalaya"/><w:sz w:val="32"/><w:szCs w:val="32"/></w:rPr><w:tab/></w:r><w:r><w:rPr><w:rFonts w:ascii="Microsoft Himalaya" w:eastAsia="Microsoft Himalaya" w:hAnsi="Microsoft Himalaya" w:cs="Microsoft Himalaya"/><w:color w:val="3F78B5"/><w:sz w:val="32"/><w:szCs w:val="32"/></w:rPr><w:t>{dstsNo3}</w:t></w:r><w:r><w:rPr><w:rFonts w:ascii="Microsoft Himalaya" w:eastAsia="Microsoft Himalaya" w:hAnsi="Microsoft Himalaya" w:cs="Microsoft Himalaya"/><w:sz w:val="32"/><w:szCs w:val="32"/></w:rPr><w:tab/></w:r><w:r><w:rPr><w:rFonts w:ascii="Microsoft Himalaya" w:eastAsia="Microsoft Himalaya" w:hAnsi="Microsoft Himalaya" w:cs="Microsoft Himalaya"/><w:color w:val="3F78B5"/><w:sz w:val="32"/><w:szCs w:val="32"/></w:rPr><w:t>{dstsNo4}</w:t></w:r></w:p><w:p><w:pPr><w:framePr w:w="4430" w:h="360" w:hRule="exact" w:wrap="none" w:vAnchor="page" w:hAnchor="page" w:x="2854" w:y="7990"/><w:tabs><w:tab w:val="center" w:pos="400"/><w:tab w:val="center" w:pos="910"/><w:tab w:val="center" w:pos="1452"/><w:tab w:val="center" w:pos="1962"/><w:tab w:val="center" w:pos="2496"/><w:tab w:val="center" w:pos="3008"/><w:tab w:val="center" w:pos="3518"/><w:tab w:val="center" w:pos="4030"/></w:tabs><w:spacing w:line="360" w:lineRule="exact"/></w:pPr><w:r><w:rPr><w:rFonts w:ascii="Microsoft Himalaya" w:eastAsia="Microsoft Himalaya" w:hAnsi="Microsoft Himalaya" w:cs="Microsoft Himalaya"/><w:sz w:val="32"/><w:szCs w:val="32"/></w:rPr><w:tab/></w:r><w:r><w:rPr><w:rFonts w:ascii="Microsoft Himalaya" w:eastAsia="Microsoft Himalaya" w:hAnsi="Microsoft Himalaya" w:cs="Microsoft Himalaya"/><w:color w:val="3F78B5"/><w:sz w:val="32"/><w:szCs w:val="32"/></w:rPr><w:t>{examDate1}</w:t></w:r><w:r><w:rPr><w:rFonts w:ascii="Microsoft Himalaya" w:eastAsia="Microsoft Himalaya" w:hAnsi="Microsoft Himalaya" w:cs="Microsoft Himalaya"/><w:sz w:val="32"/><w:szCs w:val="32"/></w:rPr><w:tab/></w:r><w:r><w:rPr><w:rFonts w:ascii="Microsoft Himalaya" w:eastAsia="Microsoft Himalaya" w:hAnsi="Microsoft Himalaya" w:cs="Microsoft Himalaya"/><w:color w:val="3F78B5"/><w:sz w:val="32"/><w:szCs w:val="32"/></w:rPr><w:t>{examDate2}</w:t></w:r><w:r><w:rPr><w:rFonts w:ascii="Microsoft Himalaya" w:eastAsia="Microsoft Himalaya" w:hAnsi="Microsoft Himalaya" w:cs="Microsoft Himalaya"/><w:sz w:val="32"/><w:szCs w:val="32"/></w:rPr><w:tab/></w:r><w:r><w:rPr><w:rFonts w:ascii="Microsoft Himalaya" w:eastAsia="Microsoft Himalaya" w:hAnsi="Microsoft Himalaya" w:cs="Microsoft Himalaya"/><w:color w:val="3F78B5"/><w:sz w:val="32"/><w:szCs w:val="32"/></w:rPr><w:t>{examDate3}</w:t></w:r><w:r><w:rPr><w:rFonts w:ascii="Microsoft Himalaya" w:eastAsia="Microsoft Himalaya" w:hAnsi="Microsoft Himalaya" w:cs="Microsoft Himalaya"/><w:sz w:val="32"/><w:szCs w:val="32"/></w:rPr><w:tab/></w:r><w:r><w:rPr><w:rFonts w:ascii="Microsoft Himalaya" w:eastAsia="Microsoft Himalaya" w:hAnsi="Microsoft Himalaya" w:cs="Microsoft Himalaya"/><w:color w:val="3F78B5"/><w:sz w:val="32"/><w:szCs w:val="32"/></w:rPr><w:t>{examDate4}</w:t></w:r><w:r><w:rPr><w:rFonts w:ascii="Microsoft Himalaya" w:eastAsia="Microsoft Himalaya" w:hAnsi="Microsoft Himalaya" w:cs="Microsoft Himalaya"/><w:sz w:val="32"/><w:szCs w:val="32"/></w:rPr><w:tab/></w:r><w:r><w:rPr><w:rFonts w:ascii="Microsoft Himalaya" w:eastAsia="Microsoft Himalaya" w:hAnsi="Microsoft Himalaya" w:cs="Microsoft Himalaya"/><w:color w:val="3F78B5"/><w:sz w:val="32"/><w:szCs w:val="32"/></w:rPr><w:t>{examDate5}</w:t></w:r><w:r><w:rPr><w:rFonts w:ascii="Microsoft Himalaya" w:eastAsia="Microsoft Himalaya" w:hAnsi="Microsoft Himalaya" w:cs="Microsoft Himalaya"/><w:sz w:val="32"/><w:szCs w:val="32"/></w:rPr><w:tab/></w:r><w:r><w:rPr><w:rFonts w:ascii="Microsoft Himalaya" w:eastAsia="Microsoft Himalaya" w:hAnsi="Microsoft Himalaya" w:cs="Microsoft Himalaya"/><w:color w:val="3F78B5"/><w:sz w:val="32"/><w:szCs w:val="32"/></w:rPr><w:t>{examDate6}</w:t></w:r><w:r><w:rPr><w:rFonts w:ascii="Microsoft Himalaya" w:eastAsia="Microsoft Himalaya" w:hAnsi="Microsoft Himalaya" w:cs="Microsoft Himalaya"/><w:sz w:val="32"/><w:szCs w:val="32"/></w:rPr><w:tab/></w:r><w:r><w:rPr><w:rFonts w:ascii="Microsoft Himalaya" w:eastAsia="Microsoft Himalaya" w:hAnsi="Microsoft Himalaya" w:cs="Microsoft Himalaya"/><w:color w:val="3F78B5"/><w:sz w:val="32"/><w:szCs w:val="32"/></w:rPr><w:t>{examDate7}</w:t></w:r><w:r><w:rPr><w:rFonts w:ascii="Microsoft Himalaya" w:eastAsia="Microsoft Himalaya" w:hAnsi="Microsoft Himalaya" w:cs="Microsoft Himalaya"/><w:sz w:val="32"/><w:szCs w:val="32"/></w:rPr><w:tab/></w:r><w:r><w:rPr><w:rFonts w:ascii="Microsoft Himalaya" w:eastAsia="Microsoft Himalaya" w:hAnsi="Microsoft Himalaya" w:cs="Microsoft Himalaya"/><w:color w:val="3F78B5"/><w:sz w:val="32"/><w:szCs w:val="32"/></w:rPr><w:t>{examDate8}</w:t></w:r></w:p><w:p><w:pPr><w:framePr w:w="720" w:h="318" w:hRule="exact" w:wrap="none" w:vAnchor="page" w:hAnchor="page" w:x="3598" w:y="9646"/><w:spacing w:line="318" w:lineRule="exact"/><w:jc w:val="center"/></w:pPr><w:r><w:rPr><w:rFonts w:ascii="Microsoft Himalaya" w:eastAsia="Microsoft Himalaya" w:hAnsi="Microsoft Himalaya" w:cs="Microsoft Himalaya"/><w:sz w:val="28"/><w:szCs w:val="28"/></w:rPr><w:t>{listeningScore}</w:t></w:r></w:p><w:p><w:pPr><w:framePr w:w="720" w:h="318" w:hRule="exact" w:wrap="none" w:vAnchor="page" w:hAnchor="page" w:x="3610" w:y="10466"/><w:spacing w:line="318" w:lineRule="exact"/><w:jc w:val="center"/></w:pPr><w:r><w:rPr><w:rFonts w:ascii="Microsoft Himalaya" w:eastAsia="Microsoft Himalaya" w:hAnsi="Microsoft Himalaya" w:cs="Microsoft Himalaya"/><w:sz w:val="28"/><w:szCs w:val="28"/></w:rPr><w:t>{readingScore}</w:t></w:r></w:p><w:p><w:pPr><w:framePr w:w="720" w:h="318" w:hRule="exact" w:wrap="none" w:vAnchor="page" w:hAnchor="page" w:x="3598" w:y="11234"/><w:spacing w:line="318" w:lineRule="exact"/><w:jc w:val="center"/></w:pPr><w:r><w:rPr><w:rFonts w:ascii="Microsoft Himalaya" w:eastAsia="Microsoft Himalaya" w:hAnsi="Microsoft Himalaya" w:cs="Microsoft Himalaya"/><w:sz w:val="28"/><w:szCs w:val="28"/></w:rPr><w:t>{writingScore}</w:t></w:r></w:p><w:p><w:pPr><w:framePr w:w="720" w:h="318" w:hRule="exact" w:wrap="none" w:vAnchor="page" w:hAnchor="page" w:x="3598" w:y="11996"/><w:spacing w:line="318" w:lineRule="exact"/><w:jc w:val="center"/></w:pPr><w:r><w:rPr><w:rFonts w:ascii="Microsoft Himalaya" w:eastAsia="Microsoft Himalaya" w:hAnsi="Microsoft Himalaya" w:cs="Microsoft Himalaya"/><w:sz w:val="28"/><w:szCs w:val="28"/></w:rPr><w:t>{speakingScore}</w:t></w:r></w:p><w:p><w:pPr><w:framePr w:w="720" w:h="318" w:hRule="exact" w:wrap="none" w:vAnchor="page" w:hAnchor="page" w:x="8278" w:y="9386"/><w:spacing w:line="318" w:lineRule="exact"/><w:jc w:val="center"/></w:pPr><w:r><w:rPr><w:rFonts w:ascii="Microsoft Himalaya" w:eastAsia="Microsoft Himalaya" w:hAnsi="Microsoft Himalaya" w:cs="Microsoft Himalaya"/><w:sz w:val="28"/><w:szCs w:val="28"/></w:rPr><w:t>{overallScoreDz}</w:t></w:r></w:p><w:p><w:pPr><w:framePr w:w="720" w:h="350" w:hRule="exact" w:wrap="none" w:vAnchor="page" w:hAnchor="page" w:x="8280" w:y="10054"/><w:spacing w:line="350" w:lineRule="exact"/><w:jc w:val="center"/></w:pPr><w:r><w:rPr><w:b/><w:bCs/><w:color w:val="00B050"/><w:sz w:val="32"/><w:szCs w:val="32"/></w:rPr><w:t>{overallScore}</w:t></w:r></w:p><w:p><w:pPr><w:framePr w:w="3804" w:h="360" w:hRule="exact" w:wrap="none" w:vAnchor="page" w:hAnchor="page" w:x="6332" w:y="12040"/><w:tabs><w:tab w:val="center" w:pos="400"/><w:tab w:val="center" w:pos="816"/><w:tab w:val="center" w:pos="1272"/><w:tab w:val="center" w:pos="1726"/><w:tab w:val="center" w:pos="2146"/><w:tab w:val="center" w:pos="2554"/><w:tab w:val="center" w:pos="2978"/><w:tab w:val="center" w:pos="3404"/></w:tabs><w:spacing w:line="360" w:lineRule="exact"/></w:pPr><w:r><w:rPr><w:rFonts w:ascii="Microsoft Himalaya" w:eastAsia="Microsoft Himalaya" w:hAnsi="Microsoft Himalaya" w:cs="Microsoft Himalaya"/><w:sz w:val="32"/><w:szCs w:val="32"/></w:rPr><w:tab/></w:r><w:r><w:rPr><w:rFonts w:ascii="Microsoft Himalaya" w:eastAsia="Microsoft Himalaya" w:hAnsi="Microsoft Himalaya" w:cs="Microsoft Himalaya"/><w:color w:val="3F78B5"/><w:sz w:val="32"/><w:szCs w:val="32"/></w:rPr><w:t>{validity1}</w:t></w:r><w:r><w:rPr><w:rFonts w:ascii="Microsoft Himalaya" w:eastAsia="Microsoft Himalaya" w:hAnsi="Microsoft Himalaya" w:cs="Microsoft Himalaya"/><w:sz w:val="32"/><w:szCs w:val="32"/></w:rPr><w:tab/></w:r><w:r><w:rPr><w:rFonts w:ascii="Microsoft Himalaya" w:eastAsia="Microsoft Himalaya" w:hAnsi="Microsoft Himalaya" w:cs="Microsoft Himalaya"/><w:color w:val="3F78B5"/><w:sz w:val="32"/><w:szCs w:val="32"/></w:rPr><w:t>{validity2}</w:t></w:r><w:r><w:rPr><w:rFonts w:ascii="Microsoft Himalaya" w:eastAsia="Microsoft Himalaya" w:hAnsi="Microsoft Himalaya" w:cs="Microsoft Himalaya"/><w:sz w:val="32"/><w:szCs w:val="32"/></w:rPr><w:tab/></w:r><w:r><w:rPr><w:rFonts w:ascii="Microsoft Himalaya" w:eastAsia="Microsoft Himalaya" w:hAnsi="Microsoft Himalaya" w:cs="Microsoft Himalaya"/><w:color w:val="3F78B5"/><w:sz w:val="32"/><w:szCs w:val="32"/></w:rPr><w:t>{validity3}</w:t></w:r><w:r><w:rPr><w:rFonts w:ascii="Microsoft Himalaya" w:eastAsia="Microsoft Himalaya" w:hAnsi="Microsoft Himalaya" w:cs="Microsoft Himalaya"/><w:sz w:val="32"/><w:szCs w:val="32"/></w:rPr><w:tab/></w:r><w:r><w:rPr><w:rFonts w:ascii="Microsoft Himalaya" w:eastAsia="Microsoft Himalaya" w:hAnsi="Microsoft Himalaya" w:cs="Microsoft Himalaya"/><w:color w:val="3F78B5"/><w:sz w:val="32"/><w:szCs w:val="32"/></w:rPr><w:t>{validity4}</w:t></w:r><w:r><w:rPr><w:rFonts w:ascii="Microsoft Himalaya" w:eastAsia="Microsoft Himalaya" w:hAnsi="Microsoft Himalaya" w:cs="Microsoft Himalaya"/><w:sz w:val="32"/><w:szCs w:val="32"/></w:rPr><w:tab/></w:r><w:r><w:rPr><w:rFonts w:ascii="Microsoft Himalaya" w:eastAsia="Microsoft Himalaya" w:hAnsi="Microsoft Himalaya" w:cs="Microsoft Himalaya"/><w:color w:val="3F78B5"/><w:sz w:val="32"/><w:szCs w:val="32"/></w:rPr><w:t>{validity5}</w:t></w:r><w:r><w:rPr><w:rFonts w:ascii="Microsoft Himalaya" w:eastAsia="Microsoft Himalaya" w:hAnsi="Microsoft Himalaya" w:cs="Microsoft Himalaya"/><w:sz w:val="32"/><w:szCs w:val="32"/></w:rPr><w:tab/></w:r><w:r><w:rPr><w:rFonts w:ascii="Microsoft Himalaya" w:eastAsia="Microsoft Himalaya" w:hAnsi="Microsoft Himalaya" w:cs="Microsoft Himalaya"/><w:color w:val="3F78B5"/><w:sz w:val="32"/><w:szCs w:val="32"/></w:rPr><w:t>{validity6}</w:t></w:r><w:r><w:rPr><w:rFonts w:ascii="Microsoft Himalaya" w:eastAsia="Microsoft Himalaya" w:hAnsi="Microsoft Himalaya" w:cs="Microsoft Himalaya"/><w:sz w:val="32"/><w:szCs w:val="32"/></w:rPr><w:tab/></w:r><w:r><w:rPr><w:rFonts w:ascii="Microsoft Himalaya" w:eastAsia="Microsoft Himalaya" w:hAnsi="Microsoft Himalaya" w:cs="Microsoft Himalaya"/><w:color w:val="3F78B5"/><w:sz w:val="32"/><w:szCs w:val="32"/></w:rPr><w:t>{validity7}</w:t></w:r><w:r><w:rPr><w:rFonts w:ascii="Microsoft Himalaya" w:eastAsia="Microsoft Himalaya" w:hAnsi="Microsoft Himalaya" w:cs="Microsoft Himalaya"/><w:sz w:val="32"/><w:szCs w:val="32"/></w:rPr><w:tab/></w:r><w:r><w:rPr><w:rFonts w:ascii="Microsoft Himalaya" w:eastAsia="Microsoft Himalaya" w:hAnsi="Microsoft Himalaya" w:cs="Microsoft Himalaya"/><w:color w:val="3F78B5"/><w:sz w:val="32"/><w:szCs w:val="32"/></w:rPr><w:t>{validity8}</w:t></w:r></w:p><w:sectPr><w:pgSz w:w="10800" w:h="15595"/><w:pgMar w:top="0" w:right="0" w:bottom="0" w:left="0" w:header="0" w:footer="0" w:gutter="0"/><w:cols w:space="720"/><w:docGrid w:linePitch="360"/></w:sectPr></w:body></w:document>
+<file path=word/document.xml><?xml version="1.0" encoding="utf-8"?>
+<w:document xmlns:wpc="http://schemas.microsoft.com/office/word/2010/wordprocessingCanvas" xmlns:cx="http://schemas.microsoft.com/office/drawing/2014/chartex" xmlns:cx1="http://schemas.microsoft.com/office/drawing/2015/9/8/chartex" xmlns:cx2="http://schemas.microsoft.com/office/drawing/2015/10/21/chartex" xmlns:cx3="http://schemas.microsoft.com/office/drawing/2016/5/9/chartex" xmlns:cx4="http://schemas.microsoft.com/office/drawing/2016/5/10/chartex" xmlns:cx5="http://schemas.microsoft.com/office/drawing/2016/5/11/chartex" xmlns:cx6="http://schemas.microsoft.com/office/drawing/2016/5/12/chartex" xmlns:cx7="http://schemas.microsoft.com/office/drawing/2016/5/13/chartex" xmlns:cx8="http://schemas.microsoft.com/office/drawing/2016/5/14/chartex" xmlns:mc="http://schemas.openxmlformats.org/markup-compatibility/2006" xmlns:aink="http://schemas.microsoft.com/office/drawing/2016/ink" xmlns:am3d="http://schemas.microsoft.com/office/drawing/2017/model3d" xmlns:o="urn:schemas-microsoft-com:office:office" xmlns:r="http://schemas.openxmlformats.org/officeDocument/2006/relationships" xmlns:m="http://schemas.openxmlformats.org/officeDocument/2006/math" xmlns:v="urn:schemas-microsoft-com:vml" xmlns:wp14="http://schemas.microsoft.com/office/word/2010/wordprocessingDrawing" xmlns:wp="http://schemas.openxmlformats.org/drawingml/2006/wordprocessingDrawing" xmlns:w10="urn:schemas-microsoft-com:office:word" xmlns:w="http://schemas.openxmlformats.org/wordprocessingml/2006/main" xmlns:w14="http://schemas.microsoft.com/office/word/2010/wordml" xmlns:w15="http://schemas.microsoft.com/office/word/2012/wordml" xmlns:w16cex="http://schemas.microsoft.com/office/word/2018/wordml/cex" xmlns:w16cid="http://schemas.microsoft.com/office/word/2016/wordml/cid" xmlns:w16="http://schemas.microsoft.com/office/word/2018/wordml" xmlns:w16sdtdh="http://schemas.microsoft.com/office/word/2020/wordml/sdtdatahash" xmlns:w16se="http://schemas.microsoft.com/office/word/2015/wordml/symex" xmlns:wpg="http://schemas.microsoft.com/office/word/2010/wordprocessingGroup" xmlns:wpi="http://schemas.microsoft.com/office/word/2010/wordprocessingInk" xmlns:wne="http://schemas.microsoft.com/office/word/2006/wordml" xmlns:wps="http://schemas.microsoft.com/office/word/2010/wordprocessingShape" mc:Ignorable="w14 w15 w16se w16cid w16 w16cex w16sdtdh wp14">
+  <w:body>
+    <w:p>
+      <w:pPr>
+        <w:spacing w:line="20" w:lineRule="exact"/>
+      </w:pPr>
+      <w:r>
+        <w:rPr>
+          <w:noProof/>
+        </w:rPr>
+        <w:drawing>
+          <wp:anchor distT="0" distB="0" distL="0" distR="0" simplePos="0" relativeHeight="9902952" behindDoc="1" locked="0" layoutInCell="1" allowOverlap="1" wp14:anchorId="26443A98" wp14:editId="22889397">
+            <wp:simplePos x="0" y="0"/>
+            <wp:positionH relativeFrom="page">
+              <wp:posOffset>0</wp:posOffset>
+            </wp:positionH>
+            <wp:positionV relativeFrom="page">
+              <wp:posOffset>0</wp:posOffset>
+            </wp:positionV>
+            <wp:extent cx="6858000" cy="9902952"/>
+            <wp:effectExtent l="0" t="0" r="0" b="0"/>
+            <wp:wrapNone/>
+            <wp:docPr id="1" name="bg" descr="Certificate design (border, logos, clouds, boxes, fixed Dzongkha labels)" title="Certificate background"/>
+            <wp:cNvGraphicFramePr>
+              <a:graphicFrameLocks xmlns:a="http://schemas.openxmlformats.org/drawingml/2006/main" noChangeAspect="1"/>
+            </wp:cNvGraphicFramePr>
+            <a:graphic xmlns:a="http://schemas.openxmlformats.org/drawingml/2006/main">
+              <a:graphicData uri="http://schemas.openxmlformats.org/drawingml/2006/picture">
+                <pic:pic xmlns:pic="http://schemas.openxmlformats.org/drawingml/2006/picture">
+                  <pic:nvPicPr>
+                    <pic:cNvPr id="0" name=""/>
+                    <pic:cNvPicPr>
+                      <a:picLocks noChangeAspect="1" noChangeArrowheads="1"/>
+                    </pic:cNvPicPr>
+                  </pic:nvPicPr>
+                  <pic:blipFill>
+                    <a:blip r:embed="rId5"/>
+                    <a:srcRect/>
+                    <a:stretch>
+                      <a:fillRect/>
+                    </a:stretch>
+                  </pic:blipFill>
+                  <pic:spPr bwMode="auto">
+                    <a:xfrm>
+                      <a:off x="0" y="0"/>
+                      <a:ext cx="6858000" cy="9902952"/>
+                    </a:xfrm>
+                    <a:prstGeom prst="rect">
+                      <a:avLst/>
+                    </a:prstGeom>
+                  </pic:spPr>
+                </pic:pic>
+              </a:graphicData>
+            </a:graphic>
+          </wp:anchor>
+        </w:drawing>
+      </w:r>
+    </w:p>
+    <w:p>
+      <w:pPr>
+        <w:framePr w:w="2640" w:h="340" w:hRule="exact" w:wrap="none" w:vAnchor="page" w:hAnchor="page" w:x="4080" w:y="2754"/>
+        <w:spacing w:line="340" w:lineRule="exact"/>
+        <w:jc w:val="center"/>
+      </w:pPr>
+      <w:r>
+        <w:rPr>
+          <w:rFonts w:ascii="Times New Roman" w:eastAsia="Times New Roman" w:hAnsi="Times New Roman" w:cs="Times New Roman"/>
+          <w:sz w:val="28"/>
+          <w:szCs w:val="28"/>
+        </w:rPr>
+        <w:t>DSTS CERTIFICATE</w:t>
+      </w:r>
+    </w:p>
+    <w:p>
+      <w:pPr>
+        <w:framePr w:w="2000" w:h="304" w:hRule="exact" w:wrap="none" w:vAnchor="page" w:hAnchor="page" w:x="554" w:y="4550"/>
+        <w:spacing w:line="304" w:lineRule="exact"/>
+      </w:pPr>
+      <w:r>
+        <w:rPr>
+          <w:rFonts w:ascii="Book Antiqua" w:eastAsia="Book Antiqua" w:hAnsi="Book Antiqua" w:cs="Book Antiqua"/>
+        </w:rPr>
+        <w:t>Name</w:t>
+      </w:r>
+    </w:p>
+    <w:p>
+      <w:pPr>
+        <w:framePr w:w="2000" w:h="304" w:hRule="exact" w:wrap="none" w:vAnchor="page" w:hAnchor="page" w:x="628" w:y="5480"/>
+        <w:spacing w:line="304" w:lineRule="exact"/>
+      </w:pPr>
+      <w:r>
+        <w:rPr>
+          <w:rFonts w:ascii="Book Antiqua" w:eastAsia="Book Antiqua" w:hAnsi="Book Antiqua" w:cs="Book Antiqua"/>
+        </w:rPr>
+        <w:t>ID No.</w:t>
+      </w:r>
+    </w:p>
+    <w:p>
+      <w:pPr>
+        <w:framePr w:w="2800" w:h="304" w:hRule="exact" w:wrap="none" w:vAnchor="page" w:hAnchor="page" w:x="554" w:y="6500"/>
+        <w:spacing w:line="304" w:lineRule="exact"/>
+      </w:pPr>
+      <w:r>
+        <w:rPr>
+          <w:rFonts w:ascii="Book Antiqua" w:eastAsia="Book Antiqua" w:hAnsi="Book Antiqua" w:cs="Book Antiqua"/>
+        </w:rPr>
+        <w:t>Date of Birth</w:t>
+      </w:r>
+    </w:p>
+    <w:p>
+      <w:pPr>
+        <w:framePr w:w="2400" w:h="304" w:hRule="exact" w:wrap="none" w:vAnchor="page" w:hAnchor="page" w:x="540" w:y="7296"/>
+        <w:spacing w:line="304" w:lineRule="exact"/>
+      </w:pPr>
+      <w:r>
+        <w:rPr>
+          <w:rFonts w:ascii="Book Antiqua" w:eastAsia="Book Antiqua" w:hAnsi="Book Antiqua" w:cs="Book Antiqua"/>
+        </w:rPr>
+        <w:t>DSTS No.</w:t>
+      </w:r>
+    </w:p>
+    <w:p>
+      <w:pPr>
+        <w:framePr w:w="3800" w:h="304" w:hRule="exact" w:wrap="none" w:vAnchor="page" w:hAnchor="page" w:x="512" w:y="8158"/>
+        <w:spacing w:line="304" w:lineRule="exact"/>
+      </w:pPr>
+      <w:r>
+        <w:rPr>
+          <w:rFonts w:ascii="Book Antiqua" w:eastAsia="Book Antiqua" w:hAnsi="Book Antiqua" w:cs="Book Antiqua"/>
+        </w:rPr>
+        <w:t>Date of Examination</w:t>
+      </w:r>
+    </w:p>
+    <w:p>
+      <w:pPr>
+        <w:framePr w:w="2500" w:h="304" w:hRule="exact" w:wrap="none" w:vAnchor="page" w:hAnchor="page" w:x="1008" w:y="9674"/>
+        <w:spacing w:line="304" w:lineRule="exact"/>
+      </w:pPr>
+      <w:r>
+        <w:rPr>
+          <w:rFonts w:ascii="Book Antiqua" w:eastAsia="Book Antiqua" w:hAnsi="Book Antiqua" w:cs="Book Antiqua"/>
+        </w:rPr>
+        <w:t>LISTENING</w:t>
+      </w:r>
+    </w:p>
+    <w:p>
+      <w:pPr>
+        <w:framePr w:w="2000" w:h="304" w:hRule="exact" w:wrap="none" w:vAnchor="page" w:hAnchor="page" w:x="1034" w:y="10498"/>
+        <w:spacing w:line="304" w:lineRule="exact"/>
+      </w:pPr>
+      <w:r>
+        <w:rPr>
+          <w:rFonts w:ascii="Book Antiqua" w:eastAsia="Book Antiqua" w:hAnsi="Book Antiqua" w:cs="Book Antiqua"/>
+        </w:rPr>
+        <w:t>READING</w:t>
+      </w:r>
+    </w:p>
+    <w:p>
+      <w:pPr>
+        <w:framePr w:w="2000" w:h="304" w:hRule="exact" w:wrap="none" w:vAnchor="page" w:hAnchor="page" w:x="1008" w:y="11360"/>
+        <w:spacing w:line="304" w:lineRule="exact"/>
+      </w:pPr>
+      <w:r>
+        <w:rPr>
+          <w:rFonts w:ascii="Book Antiqua" w:eastAsia="Book Antiqua" w:hAnsi="Book Antiqua" w:cs="Book Antiqua"/>
+        </w:rPr>
+        <w:t>WRITING</w:t>
+      </w:r>
+    </w:p>
+    <w:p>
+      <w:pPr>
+        <w:framePr w:w="2500" w:h="304" w:hRule="exact" w:wrap="none" w:vAnchor="page" w:hAnchor="page" w:x="1034" w:y="12138"/>
+        <w:spacing w:line="304" w:lineRule="exact"/>
+      </w:pPr>
+      <w:r>
+        <w:rPr>
+          <w:rFonts w:ascii="Book Antiqua" w:eastAsia="Book Antiqua" w:hAnsi="Book Antiqua" w:cs="Book Antiqua"/>
+        </w:rPr>
+        <w:t>SPEAKING</w:t>
+      </w:r>
+    </w:p>
+    <w:p>
+      <w:pPr>
+        <w:framePr w:w="2700" w:h="326" w:hRule="exact" w:wrap="none" w:vAnchor="page" w:hAnchor="page" w:x="5762" w:y="10124"/>
+        <w:spacing w:line="326" w:lineRule="exact"/>
+      </w:pPr>
+      <w:r>
+        <w:rPr>
+          <w:rFonts w:ascii="Book Antiqua" w:eastAsia="Book Antiqua" w:hAnsi="Book Antiqua" w:cs="Book Antiqua"/>
+          <w:b/>
+          <w:bCs/>
+          <w:color w:val="00B050"/>
+          <w:sz w:val="28"/>
+          <w:szCs w:val="28"/>
+        </w:rPr>
+        <w:t>OVERALL LEVEL</w:t>
+      </w:r>
+    </w:p>
+    <w:p>
+      <w:pPr>
+        <w:framePr w:w="3500" w:h="270" w:hRule="exact" w:wrap="none" w:vAnchor="page" w:hAnchor="page" w:x="6836" w:y="11508"/>
+        <w:spacing w:line="270" w:lineRule="exact"/>
+      </w:pPr>
+      <w:r>
+        <w:rPr>
+          <w:rFonts w:ascii="Book Antiqua" w:eastAsia="Book Antiqua" w:hAnsi="Book Antiqua" w:cs="Book Antiqua"/>
+          <w:sz w:val="20"/>
+          <w:szCs w:val="20"/>
+        </w:rPr>
+        <w:t xml:space="preserve">This certificate is valid </w:t>
+      </w:r>
+      <w:proofErr w:type="spellStart"/>
+      <w:r>
+        <w:rPr>
+          <w:rFonts w:ascii="Book Antiqua" w:eastAsia="Book Antiqua" w:hAnsi="Book Antiqua" w:cs="Book Antiqua"/>
+          <w:sz w:val="20"/>
+          <w:szCs w:val="20"/>
+        </w:rPr>
+        <w:t>until</w:t>
+      </w:r>
+      <w:proofErr w:type="spellEnd"/>
+    </w:p>
+    <w:p>
+      <w:pPr>
+        <w:framePr w:w="3000" w:h="304" w:hRule="exact" w:wrap="none" w:vAnchor="page" w:hAnchor="page" w:x="1324" w:y="14556"/>
+        <w:spacing w:line="304" w:lineRule="exact"/>
+      </w:pPr>
+      <w:r>
+        <w:rPr>
+          <w:rFonts w:ascii="Times New Roman" w:eastAsia="Times New Roman" w:hAnsi="Times New Roman" w:cs="Times New Roman"/>
+          <w:sz w:val="26"/>
+          <w:szCs w:val="26"/>
+        </w:rPr>
+        <w:t>Chief of Examination</w:t>
+      </w:r>
+    </w:p>
+    <w:p>
+      <w:pPr>
+        <w:framePr w:w="3300" w:h="304" w:hRule="exact" w:wrap="none" w:vAnchor="page" w:hAnchor="page" w:x="6922" w:y="14556"/>
+        <w:spacing w:line="304" w:lineRule="exact"/>
+      </w:pPr>
+      <w:r>
+        <w:rPr>
+          <w:rFonts w:ascii="Times New Roman" w:eastAsia="Times New Roman" w:hAnsi="Times New Roman" w:cs="Times New Roman"/>
+          <w:sz w:val="26"/>
+          <w:szCs w:val="26"/>
+        </w:rPr>
+        <w:t>Chief Executive, DSTS</w:t>
+      </w:r>
+    </w:p>
+    <w:p>
+      <w:pPr>
+        <w:framePr w:w="1600" w:h="360" w:hRule="exact" w:wrap="none" w:vAnchor="page" w:hAnchor="page" w:x="8000" w:y="4068"/>
+        <w:spacing w:line="360" w:lineRule="exact"/>
+        <w:jc w:val="center"/>
+      </w:pPr>
+      <w:r>
+        <w:rPr>
+          <w:sz w:val="36"/>
+          <w:szCs w:val="36"/>
+        </w:rPr>
+        <w:t>PHOTO</w:t>
+      </w:r>
+    </w:p>
+    <w:p>
+      <w:pPr>
+        <w:framePr w:w="6000" w:h="274" w:hRule="exact" w:wrap="none" w:vAnchor="page" w:hAnchor="page" w:x="2144" w:y="3994"/>
+        <w:spacing w:line="274" w:lineRule="exact"/>
+      </w:pPr>
+      <w:proofErr w:type="spellStart"/>
+      <w:r>
+        <w:rPr>
+          <w:rFonts w:ascii="Microsoft Himalaya" w:eastAsia="Microsoft Himalaya" w:hAnsi="Microsoft Himalaya" w:cs="Microsoft Himalaya"/>
+        </w:rPr>
+        <w:t>{holderNameDz}</w:t>
+      </w:r>
+      <w:r>
+        <w:rPr>
+          <w:rFonts w:ascii="Microsoft Himalaya" w:eastAsia="Microsoft Himalaya" w:hAnsi="Microsoft Himalaya" w:cs="Microsoft Himalaya"/>
+        </w:rPr>
+        <w:t> </w:t>
+      </w:r>
+    </w:p>
+    <w:p>
+      <w:pPr>
+        <w:framePr w:w="6000" w:h="304" w:hRule="exact" w:wrap="none" w:vAnchor="page" w:hAnchor="page" w:x="2144" w:y="4614"/>
+        <w:spacing w:line="304" w:lineRule="exact"/>
+      </w:pPr>
+      <w:r>
+        <w:rPr>
+          <w:sz w:val="28"/>
+          <w:szCs w:val="28"/>
+        </w:rPr>
+        <w:t>{holderName}</w:t>
+      </w:r>
+    </w:p>
+    <w:p>
+      <w:pPr>
+        <w:framePr w:w="6000" w:h="318" w:hRule="exact" w:wrap="none" w:vAnchor="page" w:hAnchor="page" w:x="2138" w:y="5328"/>
+        <w:spacing w:line="318" w:lineRule="exact"/>
+      </w:pPr>
+      <w:r>
+        <w:rPr>
+          <w:rFonts w:ascii="Microsoft Himalaya" w:eastAsia="Microsoft Himalaya" w:hAnsi="Microsoft Himalaya" w:cs="Microsoft Himalaya"/>
+          <w:sz w:val="28"/>
+          <w:szCs w:val="28"/>
+        </w:rPr>
+        <w:t>{cidDz}</w:t>
+      </w:r>
+    </w:p>
+    <w:p>
+      <w:pPr>
+        <w:framePr w:w="6000" w:h="318" w:hRule="exact" w:wrap="none" w:vAnchor="page" w:hAnchor="page" w:x="2138" w:y="5694"/>
+        <w:spacing w:line="318" w:lineRule="exact"/>
+      </w:pPr>
+      <w:r>
+        <w:rPr>
+          <w:sz w:val="32"/>
+          <w:szCs w:val="32"/>
+        </w:rPr>
+        <w:t>{cid}</w:t>
+      </w:r>
+    </w:p>
+    <w:p>
+      <w:pPr>
+        <w:framePr w:w="5206" w:h="360" w:hRule="exact" w:wrap="none" w:vAnchor="page" w:hAnchor="page" w:x="1992" w:y="6352"/>
+        <w:tabs>
+          <w:tab w:val="center" w:pos="400"/>
+          <w:tab w:val="center" w:pos="1010"/>
+          <w:tab w:val="center" w:pos="1676"/>
+          <w:tab w:val="center" w:pos="2304"/>
+          <w:tab w:val="center" w:pos="2910"/>
+          <w:tab w:val="center" w:pos="3556"/>
+          <w:tab w:val="center" w:pos="4182"/>
+          <w:tab w:val="center" w:pos="4806"/>
+        </w:tabs>
+        <w:spacing w:line="360" w:lineRule="exact"/>
+      </w:pPr>
+      <w:r>
+        <w:rPr>
+          <w:rFonts w:ascii="Microsoft Himalaya" w:eastAsia="Microsoft Himalaya" w:hAnsi="Microsoft Himalaya" w:cs="Microsoft Himalaya"/>
+          <w:sz w:val="32"/>
+          <w:szCs w:val="32"/>
+        </w:rPr>
+        <w:tab/>
+      </w:r>
+      <w:r>
+        <w:rPr>
+          <w:rFonts w:ascii="Microsoft Himalaya" w:eastAsia="Microsoft Himalaya" w:hAnsi="Microsoft Himalaya" w:cs="Microsoft Himalaya"/>
+          <w:color w:val="3F78B5"/>
+          <w:sz w:val="32"/>
+          <w:szCs w:val="32"/>
+        </w:rPr>
+        <w:t>{dob1}</w:t>
+      </w:r>
+      <w:r>
+        <w:rPr>
+          <w:rFonts w:ascii="Microsoft Himalaya" w:eastAsia="Microsoft Himalaya" w:hAnsi="Microsoft Himalaya" w:cs="Microsoft Himalaya"/>
+          <w:sz w:val="32"/>
+          <w:szCs w:val="32"/>
+        </w:rPr>
+        <w:tab/>
+      </w:r>
+      <w:r>
+        <w:rPr>
+          <w:rFonts w:ascii="Microsoft Himalaya" w:eastAsia="Microsoft Himalaya" w:hAnsi="Microsoft Himalaya" w:cs="Microsoft Himalaya"/>
+          <w:color w:val="3F78B5"/>
+          <w:sz w:val="32"/>
+          <w:szCs w:val="32"/>
+        </w:rPr>
+        <w:t>{dob2}</w:t>
+      </w:r>
+      <w:r>
+        <w:rPr>
+          <w:rFonts w:ascii="Microsoft Himalaya" w:eastAsia="Microsoft Himalaya" w:hAnsi="Microsoft Himalaya" w:cs="Microsoft Himalaya"/>
+          <w:sz w:val="32"/>
+          <w:szCs w:val="32"/>
+        </w:rPr>
+        <w:tab/>
+      </w:r>
+      <w:r>
+        <w:rPr>
+          <w:rFonts w:ascii="Microsoft Himalaya" w:eastAsia="Microsoft Himalaya" w:hAnsi="Microsoft Himalaya" w:cs="Microsoft Himalaya"/>
+          <w:color w:val="3F78B5"/>
+          <w:sz w:val="32"/>
+          <w:szCs w:val="32"/>
+        </w:rPr>
+        <w:t>{dob3}</w:t>
+      </w:r>
+      <w:r>
+        <w:rPr>
+          <w:rFonts w:ascii="Microsoft Himalaya" w:eastAsia="Microsoft Himalaya" w:hAnsi="Microsoft Himalaya" w:cs="Microsoft Himalaya"/>
+          <w:sz w:val="32"/>
+          <w:szCs w:val="32"/>
+        </w:rPr>
+        <w:tab/>
+      </w:r>
+      <w:r>
+        <w:rPr>
+          <w:rFonts w:ascii="Microsoft Himalaya" w:eastAsia="Microsoft Himalaya" w:hAnsi="Microsoft Himalaya" w:cs="Microsoft Himalaya"/>
+          <w:color w:val="3F78B5"/>
+          <w:sz w:val="32"/>
+          <w:szCs w:val="32"/>
+        </w:rPr>
+        <w:t>{dob4}</w:t>
+      </w:r>
+      <w:r>
+        <w:rPr>
+          <w:rFonts w:ascii="Microsoft Himalaya" w:eastAsia="Microsoft Himalaya" w:hAnsi="Microsoft Himalaya" w:cs="Microsoft Himalaya"/>
+          <w:sz w:val="32"/>
+          <w:szCs w:val="32"/>
+        </w:rPr>
+        <w:tab/>
+      </w:r>
+      <w:r>
+        <w:rPr>
+          <w:rFonts w:ascii="Microsoft Himalaya" w:eastAsia="Microsoft Himalaya" w:hAnsi="Microsoft Himalaya" w:cs="Microsoft Himalaya"/>
+          <w:color w:val="3F78B5"/>
+          <w:sz w:val="32"/>
+          <w:szCs w:val="32"/>
+        </w:rPr>
+        <w:t>{dob5}</w:t>
+      </w:r>
+      <w:r>
+        <w:rPr>
+          <w:rFonts w:ascii="Microsoft Himalaya" w:eastAsia="Microsoft Himalaya" w:hAnsi="Microsoft Himalaya" w:cs="Microsoft Himalaya"/>
+          <w:sz w:val="32"/>
+          <w:szCs w:val="32"/>
+        </w:rPr>
+        <w:tab/>
+      </w:r>
+      <w:r>
+        <w:rPr>
+          <w:rFonts w:ascii="Microsoft Himalaya" w:eastAsia="Microsoft Himalaya" w:hAnsi="Microsoft Himalaya" w:cs="Microsoft Himalaya"/>
+          <w:color w:val="3F78B5"/>
+          <w:sz w:val="32"/>
+          <w:szCs w:val="32"/>
+        </w:rPr>
+        <w:t>{dob6}</w:t>
+      </w:r>
+      <w:r>
+        <w:rPr>
+          <w:rFonts w:ascii="Microsoft Himalaya" w:eastAsia="Microsoft Himalaya" w:hAnsi="Microsoft Himalaya" w:cs="Microsoft Himalaya"/>
+          <w:sz w:val="32"/>
+          <w:szCs w:val="32"/>
+        </w:rPr>
+        <w:tab/>
+      </w:r>
+      <w:r>
+        <w:rPr>
+          <w:rFonts w:ascii="Microsoft Himalaya" w:eastAsia="Microsoft Himalaya" w:hAnsi="Microsoft Himalaya" w:cs="Microsoft Himalaya"/>
+          <w:color w:val="3F78B5"/>
+          <w:sz w:val="32"/>
+          <w:szCs w:val="32"/>
+        </w:rPr>
+        <w:t>{dob7}</w:t>
+      </w:r>
+      <w:r>
+        <w:rPr>
+          <w:rFonts w:ascii="Microsoft Himalaya" w:eastAsia="Microsoft Himalaya" w:hAnsi="Microsoft Himalaya" w:cs="Microsoft Himalaya"/>
+          <w:sz w:val="32"/>
+          <w:szCs w:val="32"/>
+        </w:rPr>
+        <w:tab/>
+      </w:r>
+      <w:r>
+        <w:rPr>
+          <w:rFonts w:ascii="Microsoft Himalaya" w:eastAsia="Microsoft Himalaya" w:hAnsi="Microsoft Himalaya" w:cs="Microsoft Himalaya"/>
+          <w:color w:val="3F78B5"/>
+          <w:sz w:val="32"/>
+          <w:szCs w:val="32"/>
+        </w:rPr>
+        <w:t>{dob8}</w:t>
+      </w:r>
+    </w:p>
+    <w:p>
+      <w:pPr>
+        <w:framePr w:w="5206" w:h="360" w:hRule="exact" w:wrap="none" w:vAnchor="page" w:hAnchor="page" w:x="1992" w:y="7154"/>
+        <w:tabs>
+          <w:tab w:val="center" w:pos="400"/>
+          <w:tab w:val="center" w:pos="1010"/>
+          <w:tab w:val="center" w:pos="1676"/>
+          <w:tab w:val="center" w:pos="2304"/>
+          <w:tab w:val="center" w:pos="2910"/>
+          <w:tab w:val="center" w:pos="3556"/>
+          <w:tab w:val="center" w:pos="4182"/>
+          <w:tab w:val="center" w:pos="4806"/>
+        </w:tabs>
+        <w:spacing w:line="360" w:lineRule="exact"/>
+      </w:pPr>
+      <w:r>
+        <w:rPr>
+          <w:rFonts w:ascii="Microsoft Himalaya" w:eastAsia="Microsoft Himalaya" w:hAnsi="Microsoft Himalaya" w:cs="Microsoft Himalaya"/>
+          <w:sz w:val="32"/>
+          <w:szCs w:val="32"/>
+        </w:rPr>
+        <w:tab/>
+      </w:r>
+      <w:r>
+        <w:rPr>
+          <w:rFonts w:ascii="Microsoft Himalaya" w:eastAsia="Microsoft Himalaya" w:hAnsi="Microsoft Himalaya" w:cs="Microsoft Himalaya"/>
+          <w:color w:val="3F78B5"/>
+          <w:sz w:val="32"/>
+          <w:szCs w:val="32"/>
+        </w:rPr>
+        <w:t>{dstsNo1}</w:t>
+      </w:r>
+      <w:r>
+        <w:rPr>
+          <w:rFonts w:ascii="Microsoft Himalaya" w:eastAsia="Microsoft Himalaya" w:hAnsi="Microsoft Himalaya" w:cs="Microsoft Himalaya"/>
+          <w:sz w:val="32"/>
+          <w:szCs w:val="32"/>
+        </w:rPr>
+        <w:tab/>
+      </w:r>
+      <w:r>
+        <w:rPr>
+          <w:rFonts w:ascii="Microsoft Himalaya" w:eastAsia="Microsoft Himalaya" w:hAnsi="Microsoft Himalaya" w:cs="Microsoft Himalaya"/>
+          <w:color w:val="3F78B5"/>
+          <w:sz w:val="32"/>
+          <w:szCs w:val="32"/>
+        </w:rPr>
+        <w:t>{dstsNo2}</w:t>
+      </w:r>
+      <w:r>
+        <w:rPr>
+          <w:rFonts w:ascii="Microsoft Himalaya" w:eastAsia="Microsoft Himalaya" w:hAnsi="Microsoft Himalaya" w:cs="Microsoft Himalaya"/>
+          <w:sz w:val="32"/>
+          <w:szCs w:val="32"/>
+        </w:rPr>
+        <w:tab/>
+      </w:r>
+      <w:r>
+        <w:rPr>
+          <w:rFonts w:ascii="Microsoft Himalaya" w:eastAsia="Microsoft Himalaya" w:hAnsi="Microsoft Himalaya" w:cs="Microsoft Himalaya"/>
+          <w:color w:val="3F78B5"/>
+          <w:sz w:val="32"/>
+          <w:szCs w:val="32"/>
+        </w:rPr>
+        <w:t>{dstsNo3}</w:t>
+      </w:r>
+      <w:r>
+        <w:rPr>
+          <w:rFonts w:ascii="Microsoft Himalaya" w:eastAsia="Microsoft Himalaya" w:hAnsi="Microsoft Himalaya" w:cs="Microsoft Himalaya"/>
+          <w:sz w:val="32"/>
+          <w:szCs w:val="32"/>
+        </w:rPr>
+        <w:tab/>
+      </w:r>
+      <w:r>
+        <w:rPr>
+          <w:rFonts w:ascii="Microsoft Himalaya" w:eastAsia="Microsoft Himalaya" w:hAnsi="Microsoft Himalaya" w:cs="Microsoft Himalaya"/>
+          <w:color w:val="3F78B5"/>
+          <w:sz w:val="32"/>
+          <w:szCs w:val="32"/>
+        </w:rPr>
+        <w:t>{dstsNo4}</w:t>
+      </w:r>
+    </w:p>
+    <w:p>
+      <w:pPr>
+        <w:framePr w:w="4430" w:h="360" w:hRule="exact" w:wrap="none" w:vAnchor="page" w:hAnchor="page" w:x="2854" w:y="7990"/>
+        <w:tabs>
+          <w:tab w:val="center" w:pos="400"/>
+          <w:tab w:val="center" w:pos="910"/>
+          <w:tab w:val="center" w:pos="1452"/>
+          <w:tab w:val="center" w:pos="1962"/>
+          <w:tab w:val="center" w:pos="2496"/>
+          <w:tab w:val="center" w:pos="3008"/>
+          <w:tab w:val="center" w:pos="3518"/>
+          <w:tab w:val="center" w:pos="4030"/>
+        </w:tabs>
+        <w:spacing w:line="360" w:lineRule="exact"/>
+      </w:pPr>
+      <w:r>
+        <w:rPr>
+          <w:rFonts w:ascii="Microsoft Himalaya" w:eastAsia="Microsoft Himalaya" w:hAnsi="Microsoft Himalaya" w:cs="Microsoft Himalaya"/>
+          <w:sz w:val="32"/>
+          <w:szCs w:val="32"/>
+        </w:rPr>
+        <w:tab/>
+      </w:r>
+      <w:r>
+        <w:rPr>
+          <w:rFonts w:ascii="Microsoft Himalaya" w:eastAsia="Microsoft Himalaya" w:hAnsi="Microsoft Himalaya" w:cs="Microsoft Himalaya"/>
+          <w:color w:val="3F78B5"/>
+          <w:sz w:val="32"/>
+          <w:szCs w:val="32"/>
+        </w:rPr>
+        <w:t>{examDate1}</w:t>
+      </w:r>
+      <w:r>
+        <w:rPr>
+          <w:rFonts w:ascii="Microsoft Himalaya" w:eastAsia="Microsoft Himalaya" w:hAnsi="Microsoft Himalaya" w:cs="Microsoft Himalaya"/>
+          <w:sz w:val="32"/>
+          <w:szCs w:val="32"/>
+        </w:rPr>
+        <w:tab/>
+      </w:r>
+      <w:r>
+        <w:rPr>
+          <w:rFonts w:ascii="Microsoft Himalaya" w:eastAsia="Microsoft Himalaya" w:hAnsi="Microsoft Himalaya" w:cs="Microsoft Himalaya"/>
+          <w:color w:val="3F78B5"/>
+          <w:sz w:val="32"/>
+          <w:szCs w:val="32"/>
+        </w:rPr>
+        <w:t>{examDate2}</w:t>
+      </w:r>
+      <w:r>
+        <w:rPr>
+          <w:rFonts w:ascii="Microsoft Himalaya" w:eastAsia="Microsoft Himalaya" w:hAnsi="Microsoft Himalaya" w:cs="Microsoft Himalaya"/>
+          <w:sz w:val="32"/>
+          <w:szCs w:val="32"/>
+        </w:rPr>
+        <w:tab/>
+      </w:r>
+      <w:r>
+        <w:rPr>
+          <w:rFonts w:ascii="Microsoft Himalaya" w:eastAsia="Microsoft Himalaya" w:hAnsi="Microsoft Himalaya" w:cs="Microsoft Himalaya"/>
+          <w:color w:val="3F78B5"/>
+          <w:sz w:val="32"/>
+          <w:szCs w:val="32"/>
+        </w:rPr>
+        <w:t>{examDate3}</w:t>
+      </w:r>
+      <w:r>
+        <w:rPr>
+          <w:rFonts w:ascii="Microsoft Himalaya" w:eastAsia="Microsoft Himalaya" w:hAnsi="Microsoft Himalaya" w:cs="Microsoft Himalaya"/>
+          <w:sz w:val="32"/>
+          <w:szCs w:val="32"/>
+        </w:rPr>
+        <w:tab/>
+      </w:r>
+      <w:r>
+        <w:rPr>
+          <w:rFonts w:ascii="Microsoft Himalaya" w:eastAsia="Microsoft Himalaya" w:hAnsi="Microsoft Himalaya" w:cs="Microsoft Himalaya"/>
+          <w:color w:val="3F78B5"/>
+          <w:sz w:val="32"/>
+          <w:szCs w:val="32"/>
+        </w:rPr>
+        <w:t>{examDate4}</w:t>
+      </w:r>
+      <w:r>
+        <w:rPr>
+          <w:rFonts w:ascii="Microsoft Himalaya" w:eastAsia="Microsoft Himalaya" w:hAnsi="Microsoft Himalaya" w:cs="Microsoft Himalaya"/>
+          <w:sz w:val="32"/>
+          <w:szCs w:val="32"/>
+        </w:rPr>
+        <w:tab/>
+      </w:r>
+      <w:r>
+        <w:rPr>
+          <w:rFonts w:ascii="Microsoft Himalaya" w:eastAsia="Microsoft Himalaya" w:hAnsi="Microsoft Himalaya" w:cs="Microsoft Himalaya"/>
+          <w:color w:val="3F78B5"/>
+          <w:sz w:val="32"/>
+          <w:szCs w:val="32"/>
+        </w:rPr>
+        <w:t>{examDate5}</w:t>
+      </w:r>
+      <w:r>
+        <w:rPr>
+          <w:rFonts w:ascii="Microsoft Himalaya" w:eastAsia="Microsoft Himalaya" w:hAnsi="Microsoft Himalaya" w:cs="Microsoft Himalaya"/>
+          <w:sz w:val="32"/>
+          <w:szCs w:val="32"/>
+        </w:rPr>
+        <w:tab/>
+      </w:r>
+      <w:r>
+        <w:rPr>
+          <w:rFonts w:ascii="Microsoft Himalaya" w:eastAsia="Microsoft Himalaya" w:hAnsi="Microsoft Himalaya" w:cs="Microsoft Himalaya"/>
+          <w:color w:val="3F78B5"/>
+          <w:sz w:val="32"/>
+          <w:szCs w:val="32"/>
+        </w:rPr>
+        <w:t>{examDate6}</w:t>
+      </w:r>
+      <w:r>
+        <w:rPr>
+          <w:rFonts w:ascii="Microsoft Himalaya" w:eastAsia="Microsoft Himalaya" w:hAnsi="Microsoft Himalaya" w:cs="Microsoft Himalaya"/>
+          <w:sz w:val="32"/>
+          <w:szCs w:val="32"/>
+        </w:rPr>
+        <w:tab/>
+      </w:r>
+      <w:r>
+        <w:rPr>
+          <w:rFonts w:ascii="Microsoft Himalaya" w:eastAsia="Microsoft Himalaya" w:hAnsi="Microsoft Himalaya" w:cs="Microsoft Himalaya"/>
+          <w:color w:val="3F78B5"/>
+          <w:sz w:val="32"/>
+          <w:szCs w:val="32"/>
+        </w:rPr>
+        <w:t>{examDate7}</w:t>
+      </w:r>
+      <w:r>
+        <w:rPr>
+          <w:rFonts w:ascii="Microsoft Himalaya" w:eastAsia="Microsoft Himalaya" w:hAnsi="Microsoft Himalaya" w:cs="Microsoft Himalaya"/>
+          <w:sz w:val="32"/>
+          <w:szCs w:val="32"/>
+        </w:rPr>
+        <w:tab/>
+      </w:r>
+      <w:r>
+        <w:rPr>
+          <w:rFonts w:ascii="Microsoft Himalaya" w:eastAsia="Microsoft Himalaya" w:hAnsi="Microsoft Himalaya" w:cs="Microsoft Himalaya"/>
+          <w:color w:val="3F78B5"/>
+          <w:sz w:val="32"/>
+          <w:szCs w:val="32"/>
+        </w:rPr>
+        <w:t>{examDate8}</w:t>
+      </w:r>
+    </w:p>
+    <w:p>
+      <w:pPr>
+        <w:framePr w:w="720" w:h="318" w:hRule="exact" w:wrap="none" w:vAnchor="page" w:hAnchor="page" w:x="3598" w:y="9646"/>
+        <w:spacing w:line="318" w:lineRule="exact"/>
+        <w:jc w:val="center"/>
+      </w:pPr>
+      <w:r>
+        <w:rPr>
+          <w:rFonts w:ascii="Microsoft Himalaya" w:eastAsia="Microsoft Himalaya" w:hAnsi="Microsoft Himalaya" w:cs="Microsoft Himalaya"/>
+          <w:sz w:val="28"/>
+          <w:szCs w:val="28"/>
+        </w:rPr>
+        <w:t>{listeningScore}</w:t>
+      </w:r>
+    </w:p>
+    <w:p>
+      <w:pPr>
+        <w:framePr w:w="720" w:h="318" w:hRule="exact" w:wrap="none" w:vAnchor="page" w:hAnchor="page" w:x="3610" w:y="10466"/>
+        <w:spacing w:line="318" w:lineRule="exact"/>
+        <w:jc w:val="center"/>
+      </w:pPr>
+      <w:r>
+        <w:rPr>
+          <w:rFonts w:ascii="Microsoft Himalaya" w:eastAsia="Microsoft Himalaya" w:hAnsi="Microsoft Himalaya" w:cs="Microsoft Himalaya"/>
+          <w:sz w:val="28"/>
+          <w:szCs w:val="28"/>
+        </w:rPr>
+        <w:t>{readingScore}</w:t>
+      </w:r>
+    </w:p>
+    <w:p>
+      <w:pPr>
+        <w:framePr w:w="720" w:h="318" w:hRule="exact" w:wrap="none" w:vAnchor="page" w:hAnchor="page" w:x="3598" w:y="11234"/>
+        <w:spacing w:line="318" w:lineRule="exact"/>
+        <w:jc w:val="center"/>
+      </w:pPr>
+      <w:r>
+        <w:rPr>
+          <w:rFonts w:ascii="Microsoft Himalaya" w:eastAsia="Microsoft Himalaya" w:hAnsi="Microsoft Himalaya" w:cs="Microsoft Himalaya"/>
+          <w:sz w:val="28"/>
+          <w:szCs w:val="28"/>
+        </w:rPr>
+        <w:t>{writingScore}</w:t>
+      </w:r>
+    </w:p>
+    <w:p>
+      <w:pPr>
+        <w:framePr w:w="720" w:h="318" w:hRule="exact" w:wrap="none" w:vAnchor="page" w:hAnchor="page" w:x="3598" w:y="11996"/>
+        <w:spacing w:line="318" w:lineRule="exact"/>
+        <w:jc w:val="center"/>
+      </w:pPr>
+      <w:r>
+        <w:rPr>
+          <w:rFonts w:ascii="Microsoft Himalaya" w:eastAsia="Microsoft Himalaya" w:hAnsi="Microsoft Himalaya" w:cs="Microsoft Himalaya"/>
+          <w:sz w:val="28"/>
+          <w:szCs w:val="28"/>
+        </w:rPr>
+        <w:t>{speakingScore}</w:t>
+      </w:r>
+    </w:p>
+    <w:p>
+      <w:pPr>
+        <w:framePr w:w="720" w:h="318" w:hRule="exact" w:wrap="none" w:vAnchor="page" w:hAnchor="page" w:x="8278" w:y="9386"/>
+        <w:spacing w:line="318" w:lineRule="exact"/>
+        <w:jc w:val="center"/>
+      </w:pPr>
+      <w:r>
+        <w:rPr>
+          <w:rFonts w:ascii="Microsoft Himalaya" w:eastAsia="Microsoft Himalaya" w:hAnsi="Microsoft Himalaya" w:cs="Microsoft Himalaya"/>
+          <w:sz w:val="28"/>
+          <w:szCs w:val="28"/>
+        </w:rPr>
+        <w:t>{overallScoreDz}</w:t>
+      </w:r>
+    </w:p>
+    <w:p>
+      <w:pPr>
+        <w:framePr w:w="720" w:h="350" w:hRule="exact" w:wrap="none" w:vAnchor="page" w:hAnchor="page" w:x="8280" w:y="10054"/>
+        <w:spacing w:line="350" w:lineRule="exact"/>
+        <w:jc w:val="center"/>
+      </w:pPr>
+      <w:r>
+        <w:rPr>
+          <w:b/>
+          <w:bCs/>
+          <w:color w:val="00B050"/>
+          <w:sz w:val="32"/>
+          <w:szCs w:val="32"/>
+        </w:rPr>
+        <w:t>{overallScore}</w:t>
+      </w:r>
+    </w:p>
+    <w:p>
+      <w:pPr>
+        <w:framePr w:w="3804" w:h="360" w:hRule="exact" w:wrap="none" w:vAnchor="page" w:hAnchor="page" w:x="6332" w:y="12040"/>
+        <w:tabs>
+          <w:tab w:val="center" w:pos="400"/>
+          <w:tab w:val="center" w:pos="816"/>
+          <w:tab w:val="center" w:pos="1272"/>
+          <w:tab w:val="center" w:pos="1726"/>
+          <w:tab w:val="center" w:pos="2146"/>
+          <w:tab w:val="center" w:pos="2554"/>
+          <w:tab w:val="center" w:pos="2978"/>
+          <w:tab w:val="center" w:pos="3404"/>
+        </w:tabs>
+        <w:spacing w:line="360" w:lineRule="exact"/>
+      </w:pPr>
+      <w:r>
+        <w:rPr>
+          <w:rFonts w:ascii="Microsoft Himalaya" w:eastAsia="Microsoft Himalaya" w:hAnsi="Microsoft Himalaya" w:cs="Microsoft Himalaya"/>
+          <w:sz w:val="32"/>
+          <w:szCs w:val="32"/>
+        </w:rPr>
+        <w:tab/>
+      </w:r>
+      <w:r>
+        <w:rPr>
+          <w:rFonts w:ascii="Microsoft Himalaya" w:eastAsia="Microsoft Himalaya" w:hAnsi="Microsoft Himalaya" w:cs="Microsoft Himalaya"/>
+          <w:color w:val="3F78B5"/>
+          <w:sz w:val="32"/>
+          <w:szCs w:val="32"/>
+        </w:rPr>
+        <w:t>{validity1}</w:t>
+      </w:r>
+      <w:r>
+        <w:rPr>
+          <w:rFonts w:ascii="Microsoft Himalaya" w:eastAsia="Microsoft Himalaya" w:hAnsi="Microsoft Himalaya" w:cs="Microsoft Himalaya"/>
+          <w:sz w:val="32"/>
+          <w:szCs w:val="32"/>
+        </w:rPr>
+        <w:tab/>
+      </w:r>
+      <w:r>
+        <w:rPr>
+          <w:rFonts w:ascii="Microsoft Himalaya" w:eastAsia="Microsoft Himalaya" w:hAnsi="Microsoft Himalaya" w:cs="Microsoft Himalaya"/>
+          <w:color w:val="3F78B5"/>
+          <w:sz w:val="32"/>
+          <w:szCs w:val="32"/>
+        </w:rPr>
+        <w:t>{validity2}</w:t>
+      </w:r>
+      <w:r>
+        <w:rPr>
+          <w:rFonts w:ascii="Microsoft Himalaya" w:eastAsia="Microsoft Himalaya" w:hAnsi="Microsoft Himalaya" w:cs="Microsoft Himalaya"/>
+          <w:sz w:val="32"/>
+          <w:szCs w:val="32"/>
+        </w:rPr>
+        <w:tab/>
+      </w:r>
+      <w:r>
+        <w:rPr>
+          <w:rFonts w:ascii="Microsoft Himalaya" w:eastAsia="Microsoft Himalaya" w:hAnsi="Microsoft Himalaya" w:cs="Microsoft Himalaya"/>
+          <w:color w:val="3F78B5"/>
+          <w:sz w:val="32"/>
+          <w:szCs w:val="32"/>
+        </w:rPr>
+        <w:t>{validity3}</w:t>
+      </w:r>
+      <w:r>
+        <w:rPr>
+          <w:rFonts w:ascii="Microsoft Himalaya" w:eastAsia="Microsoft Himalaya" w:hAnsi="Microsoft Himalaya" w:cs="Microsoft Himalaya"/>
+          <w:sz w:val="32"/>
+          <w:szCs w:val="32"/>
+        </w:rPr>
+        <w:tab/>
+      </w:r>
+      <w:r>
+        <w:rPr>
+          <w:rFonts w:ascii="Microsoft Himalaya" w:eastAsia="Microsoft Himalaya" w:hAnsi="Microsoft Himalaya" w:cs="Microsoft Himalaya"/>
+          <w:color w:val="3F78B5"/>
+          <w:sz w:val="32"/>
+          <w:szCs w:val="32"/>
+        </w:rPr>
+        <w:t>{validity4}</w:t>
+      </w:r>
+      <w:r>
+        <w:rPr>
+          <w:rFonts w:ascii="Microsoft Himalaya" w:eastAsia="Microsoft Himalaya" w:hAnsi="Microsoft Himalaya" w:cs="Microsoft Himalaya"/>
+          <w:sz w:val="32"/>
+          <w:szCs w:val="32"/>
+        </w:rPr>
+        <w:tab/>
+      </w:r>
+      <w:r>
+        <w:rPr>
+          <w:rFonts w:ascii="Microsoft Himalaya" w:eastAsia="Microsoft Himalaya" w:hAnsi="Microsoft Himalaya" w:cs="Microsoft Himalaya"/>
+          <w:color w:val="3F78B5"/>
+          <w:sz w:val="32"/>
+          <w:szCs w:val="32"/>
+        </w:rPr>
+        <w:t>{validity5}</w:t>
+      </w:r>
+      <w:r>
+        <w:rPr>
+          <w:rFonts w:ascii="Microsoft Himalaya" w:eastAsia="Microsoft Himalaya" w:hAnsi="Microsoft Himalaya" w:cs="Microsoft Himalaya"/>
+          <w:sz w:val="32"/>
+          <w:szCs w:val="32"/>
+        </w:rPr>
+        <w:tab/>
+      </w:r>
+      <w:r>
+        <w:rPr>
+          <w:rFonts w:ascii="Microsoft Himalaya" w:eastAsia="Microsoft Himalaya" w:hAnsi="Microsoft Himalaya" w:cs="Microsoft Himalaya"/>
+          <w:color w:val="3F78B5"/>
+          <w:sz w:val="32"/>
+          <w:szCs w:val="32"/>
+        </w:rPr>
+        <w:t>{validity6}</w:t>
+      </w:r>
+      <w:r>
+        <w:rPr>
+          <w:rFonts w:ascii="Microsoft Himalaya" w:eastAsia="Microsoft Himalaya" w:hAnsi="Microsoft Himalaya" w:cs="Microsoft Himalaya"/>
+          <w:sz w:val="32"/>
+          <w:szCs w:val="32"/>
+        </w:rPr>
+        <w:tab/>
+      </w:r>
+      <w:r>
+        <w:rPr>
+          <w:rFonts w:ascii="Microsoft Himalaya" w:eastAsia="Microsoft Himalaya" w:hAnsi="Microsoft Himalaya" w:cs="Microsoft Himalaya"/>
+          <w:color w:val="3F78B5"/>
+          <w:sz w:val="32"/>
+          <w:szCs w:val="32"/>
+        </w:rPr>
+        <w:t>{validity7}</w:t>
+      </w:r>
+      <w:r>
+        <w:rPr>
+          <w:rFonts w:ascii="Microsoft Himalaya" w:eastAsia="Microsoft Himalaya" w:hAnsi="Microsoft Himalaya" w:cs="Microsoft Himalaya"/>
+          <w:sz w:val="32"/>
+          <w:szCs w:val="32"/>
+        </w:rPr>
+        <w:tab/>
+      </w:r>
+      <w:r>
+        <w:rPr>
+          <w:rFonts w:ascii="Microsoft Himalaya" w:eastAsia="Microsoft Himalaya" w:hAnsi="Microsoft Himalaya" w:cs="Microsoft Himalaya"/>
+          <w:color w:val="3F78B5"/>
+          <w:sz w:val="32"/>
+          <w:szCs w:val="32"/>
+        </w:rPr>
+        <w:t>{validity8}</w:t>
+      </w:r>
+    </w:p>
+    <w:sectPr>
+      <w:pgSz w:w="10800" w:h="15595"/>
+      <w:pgMar w:top="0" w:right="0" w:bottom="0" w:left="0" w:header="0" w:footer="0" w:gutter="0"/>
+      <w:cols w:space="720"/>
+      <w:docGrid w:linePitch="360"/>
+    </w:sectPr>
+  </w:body>
+</w:document>
 </file>
 
 <file path=word/numbering.xml><?xml version="1.0" encoding="utf-8"?>

</xml_diff>